<commit_message>
Replace hardcoded tenant/client IDs and URLs with placeholders
Scripts and config files now ship with YOUR_TENANT_ID, YOUR_CLIENT_ID,
and similar placeholders instead of real Azure AD, SharePoint, Dataverse,
and Container Apps values. README and Prerequisites Setup Guide updated
to document the required configuration step before running any scripts.

Co-Authored-By: Claude Opus 4.6 <noreply@anthropic.com>
</commit_message>
<xml_diff>
--- a/workshop/Prerequisites Setup Guide.docx
+++ b/workshop/Prerequisites Setup Guide.docx
@@ -190,7 +190,7 @@
         <w:pStyle w:val="ListBullet"/>
       </w:pPr>
       <w:r>
-        <w:t>You will paste these into the CONFIG section of each script before running it.</w:t>
+        <w:t>You will paste these into the CONFIG section of each script before running it. The scripts ship with placeholder values (YOUR_TENANT_ID, YOUR_CLIENT_ID, etc.) that must be replaced with your actual values.</w:t>
       </w:r>
     </w:p>
     <w:p>
@@ -405,22 +405,22 @@
         <w:pStyle w:val="ListNumber"/>
       </w:pPr>
       <w:r>
-        <w:t>In the CONFIG section near the top, update:</w:t>
+        <w:t>In the CONFIG section near the top, replace the placeholder values:</w:t>
       </w:r>
     </w:p>
     <w:p>
       <w:r>
-        <w:t xml:space="preserve">   - TENANT_ID: your Directory (tenant) ID from the app registration</w:t>
+        <w:t xml:space="preserve">   - TENANT_ID: replace YOUR_TENANT_ID with your Directory (tenant) ID</w:t>
       </w:r>
     </w:p>
     <w:p>
       <w:r>
-        <w:t xml:space="preserve">   - CLIENT_ID: your Application (client) ID from the app registration</w:t>
+        <w:t xml:space="preserve">   - CLIENT_ID: replace YOUR_CLIENT_ID with your Application (client) ID</w:t>
       </w:r>
     </w:p>
     <w:p>
       <w:r>
-        <w:t xml:space="preserve">   - SITE_URL: your SharePoint site URL (e.g., https://yourtenant.sharepoint.com/sites/RetailWarehouseDemo)</w:t>
+        <w:t xml:space="preserve">   - SITE_URL: replace YOUR_TENANT.sharepoint.com/sites/YOUR_SITE with your actual SharePoint site URL</w:t>
       </w:r>
     </w:p>
     <w:p>
@@ -563,27 +563,27 @@
         <w:pStyle w:val="ListNumber"/>
       </w:pPr>
       <w:r>
-        <w:t>In the CONFIG section near the top, update:</w:t>
+        <w:t>In the CONFIG section near the top, replace the placeholder values:</w:t>
       </w:r>
     </w:p>
     <w:p>
       <w:r>
-        <w:t xml:space="preserve">   - TENANT_ID: your Directory (tenant) ID</w:t>
+        <w:t xml:space="preserve">   - TENANT_ID: replace YOUR_TENANT_ID with your Directory (tenant) ID</w:t>
       </w:r>
     </w:p>
     <w:p>
       <w:r>
-        <w:t xml:space="preserve">   - CLIENT_ID: your Application (client) ID</w:t>
+        <w:t xml:space="preserve">   - CLIENT_ID: replace YOUR_CLIENT_ID with your Application (client) ID</w:t>
       </w:r>
     </w:p>
     <w:p>
       <w:r>
-        <w:t xml:space="preserve">   - DATAVERSE_URL: your Dataverse environment URL (find this in the Power Platform admin center under Environments, then your environment, then Environment URL)</w:t>
+        <w:t xml:space="preserve">   - DATAVERSE_URL: replace YOUR_ORG.crm.dynamics.com with your Dataverse environment URL (find this in the Power Platform admin center under Environments, then your environment, then Environment URL)</w:t>
       </w:r>
     </w:p>
     <w:p>
       <w:r>
-        <w:t xml:space="preserve">   - PUBLISHER_PREFIX: your solution publisher prefix (default is "cr")</w:t>
+        <w:t xml:space="preserve">   - PUBLISHER_PREFIX: update if your solution publisher prefix is not "cr"</w:t>
       </w:r>
     </w:p>
     <w:p>

</xml_diff>